<commit_message>
Update Linux commands document
</commit_message>
<xml_diff>
--- a/linux命令.docx
+++ b/linux命令.docx
@@ -92,6 +92,7 @@
     <w:p>
       <w:pPr>
         <w:numPr>
+          <w:ilvl w:val="0"/>
           <w:numId w:val="0"/>
         </w:numPr>
         <w:ind w:left="210" w:leftChars="0"/>
@@ -247,7 +248,6 @@
           <w:lang w:val="en-US" w:eastAsia="zh-CN" w:bidi="ar-SA"/>
         </w:rPr>
       </w:pPr>
-      <w:bookmarkStart w:id="0" w:name="_GoBack"/>
       <w:r>
         <w:rPr>
           <w:rFonts w:hint="eastAsia" w:asciiTheme="minorHAnsi" w:hAnsiTheme="minorHAnsi" w:eastAsiaTheme="minorEastAsia" w:cstheme="minorBidi"/>
@@ -259,7 +259,6 @@
         <w:t>petalinux-config --get-hw-description=.</w:t>
       </w:r>
     </w:p>
-    <w:bookmarkEnd w:id="0"/>
     <w:p>
       <w:pPr>
         <w:pStyle w:val="2"/>
@@ -473,6 +472,58 @@
     </w:p>
     <w:p>
       <w:pPr>
+        <w:pStyle w:val="4"/>
+        <w:keepNext w:val="0"/>
+        <w:keepLines w:val="0"/>
+        <w:widowControl/>
+        <w:suppressLineNumbers w:val="0"/>
+        <w:rPr>
+          <w:rFonts w:hint="eastAsia" w:asciiTheme="minorHAnsi" w:hAnsiTheme="minorHAnsi" w:eastAsiaTheme="minorEastAsia" w:cstheme="minorBidi"/>
+          <w:kern w:val="2"/>
+          <w:sz w:val="21"/>
+          <w:szCs w:val="24"/>
+          <w:lang w:val="en-US" w:eastAsia="zh-CN" w:bidi="ar-SA"/>
+        </w:rPr>
+      </w:pPr>
+      <w:r>
+        <w:rPr>
+          <w:rFonts w:hint="eastAsia" w:asciiTheme="minorHAnsi" w:hAnsiTheme="minorHAnsi" w:eastAsiaTheme="minorEastAsia" w:cstheme="minorBidi"/>
+          <w:kern w:val="2"/>
+          <w:sz w:val="21"/>
+          <w:szCs w:val="24"/>
+          <w:lang w:val="en-US" w:eastAsia="zh-CN" w:bidi="ar-SA"/>
+        </w:rPr>
+        <w:t>表示“当前目录”。</w:t>
+      </w:r>
+    </w:p>
+    <w:p>
+      <w:pPr>
+        <w:pStyle w:val="4"/>
+        <w:keepNext w:val="0"/>
+        <w:keepLines w:val="0"/>
+        <w:widowControl/>
+        <w:suppressLineNumbers w:val="0"/>
+        <w:rPr>
+          <w:rFonts w:hint="eastAsia" w:asciiTheme="minorHAnsi" w:hAnsiTheme="minorHAnsi" w:eastAsiaTheme="minorEastAsia" w:cstheme="minorBidi"/>
+          <w:kern w:val="2"/>
+          <w:sz w:val="21"/>
+          <w:szCs w:val="24"/>
+          <w:lang w:val="en-US" w:eastAsia="zh-CN" w:bidi="ar-SA"/>
+        </w:rPr>
+      </w:pPr>
+      <w:r>
+        <w:rPr>
+          <w:rFonts w:hint="eastAsia" w:asciiTheme="minorHAnsi" w:hAnsiTheme="minorHAnsi" w:eastAsiaTheme="minorEastAsia" w:cstheme="minorBidi"/>
+          <w:kern w:val="2"/>
+          <w:sz w:val="21"/>
+          <w:szCs w:val="24"/>
+          <w:lang w:val="en-US" w:eastAsia="zh-CN" w:bidi="ar-SA"/>
+        </w:rPr>
+        <w:t>执行前可以先确认文件存在：</w:t>
+      </w:r>
+    </w:p>
+    <w:p>
+      <w:pPr>
         <w:pStyle w:val="3"/>
         <w:keepNext w:val="0"/>
         <w:keepLines w:val="0"/>
@@ -495,91 +546,13 @@
           <w:szCs w:val="24"/>
           <w:lang w:val="en-US" w:eastAsia="zh-CN" w:bidi="ar-SA"/>
         </w:rPr>
-        <w:t>.</w:t>
-      </w:r>
-    </w:p>
-    <w:p>
-      <w:pPr>
-        <w:pStyle w:val="4"/>
-        <w:keepNext w:val="0"/>
-        <w:keepLines w:val="0"/>
-        <w:widowControl/>
-        <w:suppressLineNumbers w:val="0"/>
-        <w:rPr>
-          <w:rFonts w:hint="eastAsia" w:asciiTheme="minorHAnsi" w:hAnsiTheme="minorHAnsi" w:eastAsiaTheme="minorEastAsia" w:cstheme="minorBidi"/>
-          <w:kern w:val="2"/>
-          <w:sz w:val="21"/>
-          <w:szCs w:val="24"/>
-          <w:lang w:val="en-US" w:eastAsia="zh-CN" w:bidi="ar-SA"/>
-        </w:rPr>
-      </w:pPr>
-      <w:r>
-        <w:rPr>
-          <w:rFonts w:hint="eastAsia" w:asciiTheme="minorHAnsi" w:hAnsiTheme="minorHAnsi" w:eastAsiaTheme="minorEastAsia" w:cstheme="minorBidi"/>
-          <w:kern w:val="2"/>
-          <w:sz w:val="21"/>
-          <w:szCs w:val="24"/>
-          <w:lang w:val="en-US" w:eastAsia="zh-CN" w:bidi="ar-SA"/>
-        </w:rPr>
-        <w:t>表示“当前目录”。</w:t>
-      </w:r>
-    </w:p>
-    <w:p>
-      <w:pPr>
-        <w:pStyle w:val="4"/>
-        <w:keepNext w:val="0"/>
-        <w:keepLines w:val="0"/>
-        <w:widowControl/>
-        <w:suppressLineNumbers w:val="0"/>
-        <w:rPr>
-          <w:rFonts w:hint="eastAsia" w:asciiTheme="minorHAnsi" w:hAnsiTheme="minorHAnsi" w:eastAsiaTheme="minorEastAsia" w:cstheme="minorBidi"/>
-          <w:kern w:val="2"/>
-          <w:sz w:val="21"/>
-          <w:szCs w:val="24"/>
-          <w:lang w:val="en-US" w:eastAsia="zh-CN" w:bidi="ar-SA"/>
-        </w:rPr>
-      </w:pPr>
-      <w:r>
-        <w:rPr>
-          <w:rFonts w:hint="eastAsia" w:asciiTheme="minorHAnsi" w:hAnsiTheme="minorHAnsi" w:eastAsiaTheme="minorEastAsia" w:cstheme="minorBidi"/>
-          <w:kern w:val="2"/>
-          <w:sz w:val="21"/>
-          <w:szCs w:val="24"/>
-          <w:lang w:val="en-US" w:eastAsia="zh-CN" w:bidi="ar-SA"/>
-        </w:rPr>
-        <w:t>执行前可以先确认文件存在：</w:t>
-      </w:r>
-    </w:p>
-    <w:p>
-      <w:pPr>
-        <w:pStyle w:val="3"/>
-        <w:keepNext w:val="0"/>
-        <w:keepLines w:val="0"/>
-        <w:widowControl/>
-        <w:suppressLineNumbers w:val="0"/>
-        <w:bidi w:val="0"/>
-        <w:rPr>
-          <w:rFonts w:hint="eastAsia" w:asciiTheme="minorHAnsi" w:hAnsiTheme="minorHAnsi" w:eastAsiaTheme="minorEastAsia" w:cstheme="minorBidi"/>
-          <w:kern w:val="2"/>
-          <w:sz w:val="21"/>
-          <w:szCs w:val="24"/>
-          <w:lang w:val="en-US" w:eastAsia="zh-CN" w:bidi="ar-SA"/>
-        </w:rPr>
-      </w:pPr>
-      <w:r>
-        <w:rPr>
-          <w:rFonts w:hint="eastAsia" w:asciiTheme="minorHAnsi" w:hAnsiTheme="minorHAnsi" w:eastAsiaTheme="minorEastAsia" w:cstheme="minorBidi"/>
-          <w:kern w:val="2"/>
-          <w:sz w:val="21"/>
-          <w:szCs w:val="24"/>
-          <w:lang w:val="en-US" w:eastAsia="zh-CN" w:bidi="ar-SA"/>
-        </w:rPr>
         <w:t>ls -l /mnt/hgfs/share/system.hdf</w:t>
       </w:r>
     </w:p>
     <w:p>
       <w:pPr>
         <w:numPr>
+          <w:ilvl w:val="0"/>
           <w:numId w:val="0"/>
         </w:numPr>
         <w:ind w:left="210" w:leftChars="0"/>
@@ -593,13 +566,8 @@
       </w:pPr>
     </w:p>
     <w:p>
-      <w:r>
-        <w:rPr>
-          <w:rFonts w:hint="eastAsia"/>
-          <w:lang w:val="en-US" w:eastAsia="zh-CN"/>
-        </w:rPr>
-        <w:t xml:space="preserve">5 </w:t>
-      </w:r>
+      <w:bookmarkStart w:id="0" w:name="_GoBack"/>
+      <w:bookmarkEnd w:id="0"/>
       <w:r>
         <w:drawing>
           <wp:inline distT="0" distB="0" distL="114300" distR="114300">
@@ -997,6 +965,7 @@
         <w:keepLines w:val="0"/>
         <w:widowControl/>
         <w:numPr>
+          <w:ilvl w:val="0"/>
           <w:numId w:val="0"/>
         </w:numPr>
         <w:suppressLineNumbers w:val="0"/>
@@ -1162,11 +1131,11 @@
     <w:lsdException w:unhideWhenUsed="0" w:uiPriority="0" w:semiHidden="0" w:name="Document Map"/>
     <w:lsdException w:unhideWhenUsed="0" w:uiPriority="0" w:semiHidden="0" w:name="Plain Text"/>
     <w:lsdException w:unhideWhenUsed="0" w:uiPriority="0" w:semiHidden="0" w:name="E-mail Signature"/>
-    <w:lsdException w:unhideWhenUsed="0" w:uiPriority="0" w:semiHidden="0" w:name="Normal (Web)"/>
+    <w:lsdException w:qFormat="1" w:unhideWhenUsed="0" w:uiPriority="0" w:semiHidden="0" w:name="Normal (Web)"/>
     <w:lsdException w:unhideWhenUsed="0" w:uiPriority="0" w:semiHidden="0" w:name="HTML Acronym"/>
     <w:lsdException w:unhideWhenUsed="0" w:uiPriority="0" w:semiHidden="0" w:name="HTML Address"/>
     <w:lsdException w:unhideWhenUsed="0" w:uiPriority="0" w:semiHidden="0" w:name="HTML Cite"/>
-    <w:lsdException w:unhideWhenUsed="0" w:uiPriority="0" w:semiHidden="0" w:name="HTML Code"/>
+    <w:lsdException w:qFormat="1" w:unhideWhenUsed="0" w:uiPriority="0" w:semiHidden="0" w:name="HTML Code"/>
     <w:lsdException w:unhideWhenUsed="0" w:uiPriority="0" w:semiHidden="0" w:name="HTML Definition"/>
     <w:lsdException w:unhideWhenUsed="0" w:uiPriority="0" w:semiHidden="0" w:name="HTML Keyboard"/>
     <w:lsdException w:unhideWhenUsed="0" w:uiPriority="0" w:semiHidden="0" w:name="HTML Preformatted"/>
@@ -1412,6 +1381,7 @@
   <w:style w:type="paragraph" w:styleId="4">
     <w:name w:val="Normal (Web)"/>
     <w:basedOn w:val="1"/>
+    <w:qFormat/>
     <w:uiPriority w:val="0"/>
     <w:pPr>
       <w:spacing w:before="0" w:beforeAutospacing="1" w:after="0" w:afterAutospacing="1"/>
@@ -1427,6 +1397,7 @@
   <w:style w:type="character" w:styleId="7">
     <w:name w:val="HTML Code"/>
     <w:basedOn w:val="6"/>
+    <w:qFormat/>
     <w:uiPriority w:val="0"/>
     <w:rPr>
       <w:rFonts w:ascii="Courier New" w:hAnsi="Courier New"/>
@@ -1436,6 +1407,7 @@
   <w:style w:type="character" w:customStyle="1" w:styleId="8">
     <w:name w:val="fontstyle01"/>
     <w:basedOn w:val="6"/>
+    <w:qFormat/>
     <w:uiPriority w:val="0"/>
     <w:rPr>
       <w:rFonts w:ascii="宋体" w:hAnsi="宋体" w:eastAsia="宋体" w:cs="宋体"/>

</xml_diff>